<commit_message>
Add Comps Support Document template and fillable Feedback Call Guide & Survey; update sourcing guide with live comps-capture rule
</commit_message>
<xml_diff>
--- a/product-templates/Property_Data_Sourcing_Guide_3.docx
+++ b/product-templates/Property_Data_Sourcing_Guide_3.docx
@@ -1342,6 +1342,101 @@
       </w:r>
       <w:bookmarkEnd w:id="9"/>
       <w:bookmarkEnd w:id="11"/>
+    </w:p>
+    <w:p>
+      <w:pPr>
+        <w:pStyle w:val="Heading2"/>
+        <w:rPr/>
+      </w:pPr>
+      <w:r>
+        <w:rPr/>
+        <w:t>STANDING RULE: Comps Evidence Must Be Captured Live — Dealio.pro Does Not Retain It</w:t>
+      </w:r>
+    </w:p>
+    <w:p>
+      <w:pPr>
+        <w:pStyle w:val="FirstParagraph"/>
+        <w:rPr/>
+      </w:pPr>
+      <w:r>
+        <w:rPr>
+          <w:i/>
+          <w:iCs/>
+        </w:rPr>
+        <w:t xml:space="preserve">Confirmed by testing (4134 E 142nd St, August 2026): the “Download Report” PDF from step 4 above is not retrievable from Dealio.pro after the session ends. It does not appear under a property Documents tab, and it does not show up in the account’s CSV Lead Exports history. Whatever isn’t captured during the live session is effectively gone — there is no later export to fall back on.</w:t>
+      </w:r>
+    </w:p>
+    <w:p>
+      <w:pPr>
+        <w:pStyle w:val="BodyText"/>
+        <w:rPr/>
+      </w:pPr>
+      <w:r>
+        <w:rPr>
+          <w:b/>
+          <w:bCs/>
+        </w:rPr>
+        <w:t xml:space="preserve">1. </w:t>
+      </w:r>
+      <w:r>
+        <w:rPr>
+          <w:b/>
+          <w:bCs/>
+        </w:rPr>
+        <w:t xml:space="preserve">Save the downloaded PDF immediately. </w:t>
+      </w:r>
+      <w:r>
+        <w:rPr/>
+        <w:t>If “Download Report” fires a browser file download, save it straight into that deal’s Internal Working Files folder before doing anything else in the session — do not assume it can be re-downloaded from Dealio.pro afterward.</w:t>
+      </w:r>
+    </w:p>
+    <w:p>
+      <w:pPr>
+        <w:pStyle w:val="BodyText"/>
+        <w:rPr/>
+      </w:pPr>
+      <w:r>
+        <w:rPr>
+          <w:b/>
+          <w:bCs/>
+        </w:rPr>
+        <w:t xml:space="preserve">2. </w:t>
+      </w:r>
+      <w:r>
+        <w:rPr>
+          <w:b/>
+          <w:bCs/>
+        </w:rPr>
+        <w:t xml:space="preserve">Log the Comp Validation Log live, comp by comp. </w:t>
+      </w:r>
+      <w:r>
+        <w:rPr/>
+        <w:t>As each comp is evaluated (Confirmed Genuine, Moderate Confidence, Excluded, or Reclassified), write that row into the Internal Working Files workbook’s Comp Validation Log tab in the same sitting — address, both sale prices and dates, buyer type, financing type, listing language signal, and tier assigned. This live log is the durable record of how ARV was reached, not the PDF alone.</w:t>
+      </w:r>
+    </w:p>
+    <w:p>
+      <w:pPr>
+        <w:pStyle w:val="BodyText"/>
+        <w:rPr/>
+      </w:pPr>
+      <w:r>
+        <w:rPr>
+          <w:b/>
+          <w:bCs/>
+        </w:rPr>
+        <w:t xml:space="preserve">3. </w:t>
+      </w:r>
+      <w:r>
+        <w:rPr>
+          <w:b/>
+          <w:bCs/>
+        </w:rPr>
+        <w:t xml:space="preserve">Produce a client-facing Comps Support Document. </w:t>
+      </w:r>
+      <w:r>
+        <w:rPr/>
+        <w:t>In addition to the internal log, build a client-facing summary of the confirmed and moderate-confidence comps (address, sale pair, $/sqft, brief basis for the tier assigned) as evidentiary backup for the ARV figure in the report. This is a Client Deliverable (Bucket 2) — it ships with the report, not just the Internal Working Files.</w:t>
+      </w:r>
     </w:p>
     <w:p>
       <w:pPr>

</xml_diff>

<commit_message>
Correct Dealio.pro export framing to quota-based; note RentCast/Mashvisor as adjunct, not a RealFlow API substitute
</commit_message>
<xml_diff>
--- a/product-templates/Property_Data_Sourcing_Guide_3.docx
+++ b/product-templates/Property_Data_Sourcing_Guide_3.docx
@@ -113,6 +113,26 @@
       <w:r>
         <w:rPr/>
         <w:t>This is a companion reference to the Fix &amp; Flip Financial Model templates and methodology — the data gathered here (as-is value, comps, tax records, ownership/lien history) is what feeds the Assumptions and Rehab Budget tabs of those models.</w:t>
+      </w:r>
+    </w:p>
+    <w:p>
+      <w:pPr>
+        <w:pStyle w:val="BodyText"/>
+        <w:rPr/>
+      </w:pPr>
+      <w:r>
+        <w:rPr/>
+        <w:t xml:space="preserve">Dealio.pro is a white-label, user-only front end with no API of its own, built on the RealFlow platform; Newtree’s subscription includes a monthly quota of 60,000 actions (Debt Stack orders, comps reports, and skip-trace exports all draw against this same pool — not billed per click). If monthly volume grows past roughly 5,000, RealFlow’s own direct API becomes worth evaluating as an upgrade path, since that would allow genuine automated retrieval instead of the live-browser-session method documented here.</w:t>
+      </w:r>
+    </w:p>
+    <w:p>
+      <w:pPr>
+        <w:pStyle w:val="BodyText"/>
+        <w:rPr/>
+      </w:pPr>
+      <w:r>
+        <w:rPr/>
+        <w:t xml:space="preserve">A separate research pass (Aug. 2026) looked at RentCast and Mashvisor as possible additions. Neither is a substitute for RealFlow’s API — both are AVM/market-analytics tools (property and rental valuations, cap rates, days-on-market) and neither offers ownership history, debt/lien records, or skip-trace, which is the actual data RealFlow would replace. RealFlow’s direct API remains the only genuine replacement path for Dealio.pro; RentCast and Mashvisor, if ever added, would be adjunct enrichment layered on top — e.g. a second independent AVM to cross-check the comps-derived ARV, or cap rate/DOM context for BRRRR and Turnkey strategy scoring — not a migration target.</w:t>
       </w:r>
     </w:p>
     <w:p>
@@ -468,7 +488,7 @@
                 <w:szCs w:val="24"/>
                 <w:lang w:val="en-US" w:eastAsia="en-US" w:bidi="ar-SA"/>
               </w:rPr>
-              <w:t>Cost</w:t>
+              <w:t>Cost / Quota</w:t>
             </w:r>
           </w:p>
         </w:tc>
@@ -595,7 +615,7 @@
                 <w:szCs w:val="24"/>
                 <w:lang w:val="en-US" w:eastAsia="en-US" w:bidi="ar-SA"/>
               </w:rPr>
-              <w:t>Metered per Debt Stack order</w:t>
+              <w:t>Counts against monthly quota per Debt Stack order</w:t>
             </w:r>
           </w:p>
         </w:tc>
@@ -722,7 +742,7 @@
                 <w:szCs w:val="24"/>
                 <w:lang w:val="en-US" w:eastAsia="en-US" w:bidi="ar-SA"/>
               </w:rPr>
-              <w:t>Metered per comps report and per skip-trace export</w:t>
+              <w:t>Counts against monthly quota per comps report and per skip-trace export</w:t>
             </w:r>
           </w:p>
         </w:tc>
@@ -966,7 +986,7 @@
       </w:r>
       <w:r>
         <w:rPr/>
-        <w:t>This creates the property record and populates quick facts (bed/bath/sqft, tax value, owner name, loans, LTV, last sale). This step is lightweight / included, not separately metered.</w:t>
+        <w:t>This creates the property record and populates quick facts (bed/bath/sqft, tax value, owner name, loans, LTV, last sale). This step is lightweight / included, and does not draw against the monthly quota.</w:t>
       </w:r>
     </w:p>
     <w:p>
@@ -1000,7 +1020,7 @@
       </w:r>
       <w:r>
         <w:rPr/>
-        <w:t>Click Order — this is the metered/paid step. It generates the full Property Profile PDF.</w:t>
+        <w:t>Click Order — this counts against the monthly quota. It generates the full Property Profile PDF.</w:t>
       </w:r>
     </w:p>
     <w:p>
@@ -1219,7 +1239,7 @@
       </w:r>
       <w:r>
         <w:rPr/>
-        <w:t>On the Comps page: click “Select All” (top toolbar — distinct from the sidebar’s unrelated “Select All” for lead-type filters), then click “Download Report.” This is the metered/paid step — generates a PDF of all comps (took ~5-10 seconds for 91 comps in testing).</w:t>
+        <w:t>On the Comps page: click “Select All” (top toolbar — distinct from the sidebar’s unrelated “Select All” for lead-type filters), then click “Download Report.” This counts against the monthly quota — generates a PDF of all comps (took ~5-10 seconds for 91 comps in testing).</w:t>
       </w:r>
     </w:p>
     <w:p>
@@ -1304,7 +1324,7 @@
       </w:r>
       <w:r>
         <w:rPr/>
-        <w:t>Click “Export 1 Lead” (or “Export Leads”) — this is the metered/paid skip-trace step. Let it save to Google Drive.</w:t>
+        <w:t>Click “Export 1 Lead” (or “Export Leads”) — this counts against the monthly quota (skip-trace step). Let it save to Google Drive.</w:t>
       </w:r>
     </w:p>
     <w:p>
@@ -1376,14 +1396,7 @@
           <w:b/>
           <w:bCs/>
         </w:rPr>
-        <w:t xml:space="preserve">1. </w:t>
-      </w:r>
-      <w:r>
-        <w:rPr>
-          <w:b/>
-          <w:bCs/>
-        </w:rPr>
-        <w:t xml:space="preserve">Save the downloaded PDF immediately. </w:t>
+        <w:t xml:space="preserve">1. Save the downloaded PDF immediately. </w:t>
       </w:r>
       <w:r>
         <w:rPr/>
@@ -1400,14 +1413,7 @@
           <w:b/>
           <w:bCs/>
         </w:rPr>
-        <w:t xml:space="preserve">2. </w:t>
-      </w:r>
-      <w:r>
-        <w:rPr>
-          <w:b/>
-          <w:bCs/>
-        </w:rPr>
-        <w:t xml:space="preserve">Log the Comp Validation Log live, comp by comp. </w:t>
+        <w:t xml:space="preserve">2. Log the Comp Validation Log live, comp by comp. </w:t>
       </w:r>
       <w:r>
         <w:rPr/>
@@ -1424,14 +1430,7 @@
           <w:b/>
           <w:bCs/>
         </w:rPr>
-        <w:t xml:space="preserve">3. </w:t>
-      </w:r>
-      <w:r>
-        <w:rPr>
-          <w:b/>
-          <w:bCs/>
-        </w:rPr>
-        <w:t xml:space="preserve">Produce a client-facing Comps Support Document. </w:t>
+        <w:t xml:space="preserve">3. Produce a client-facing Comps Support Document. </w:t>
       </w:r>
       <w:r>
         <w:rPr/>

</xml_diff>

<commit_message>
Correct RealFlow -> Realeflow spelling; correct API note: Zapier/REST API confirmed CRM-only, no Comps/LeadPipes/Skip Trace access
</commit_message>
<xml_diff>
--- a/product-templates/Property_Data_Sourcing_Guide_3.docx
+++ b/product-templates/Property_Data_Sourcing_Guide_3.docx
@@ -122,17 +122,17 @@
       </w:pPr>
       <w:r>
         <w:rPr/>
-        <w:t xml:space="preserve">Dealio.pro is a white-label, user-only front end with no API of its own, built on the RealFlow platform; Newtree’s subscription includes a monthly quota of 60,000 actions (Debt Stack orders, comps reports, and skip-trace exports all draw against this same pool — not billed per click). If monthly volume grows past roughly 5,000, RealFlow’s own direct API becomes worth evaluating as an upgrade path, since that would allow genuine automated retrieval instead of the live-browser-session method documented here.</w:t>
-      </w:r>
-    </w:p>
-    <w:p>
-      <w:pPr>
-        <w:pStyle w:val="BodyText"/>
-        <w:rPr/>
-      </w:pPr>
-      <w:r>
-        <w:rPr/>
-        <w:t xml:space="preserve">A separate research pass (Aug. 2026) looked at RentCast and Mashvisor as possible additions. Neither is a substitute for RealFlow’s API — both are AVM/market-analytics tools (property and rental valuations, cap rates, days-on-market) and neither offers ownership history, debt/lien records, or skip-trace, which is the actual data RealFlow would replace. RealFlow’s direct API remains the only genuine replacement path for Dealio.pro; RentCast and Mashvisor, if ever added, would be adjunct enrichment layered on top — e.g. a second independent AVM to cross-check the comps-derived ARV, or cap rate/DOM context for BRRRR and Turnkey strategy scoring — not a migration target.</w:t>
+        <w:t xml:space="preserve">Dealio.pro is a white-label, user-only front end with no API of its own, built on the Realeflow platform (developers.realeflow.com); Newtree’s subscription includes a monthly quota of 60,000 actions (Debt Stack orders, comps reports, and skip-trace exports all draw against this same pool — not billed per click). CONFIRMED (Aug. 2026): Realeflow’s documented public REST API, and its Zapier integration, are CRM-only — Account status, Contacts, and Properties (create/list). Neither documents access to Comps, LeadPipes, Skip Trace, or Documents — the actual data this workflow depends on. Zapier’s own Realeflow app description states outright that it “does not include Leadpipes.” So an API key alone (Harold has one, issued for the Zapier/CRM sync) does not currently unlock automated comps or skip-trace retrieval — the live-browser-session method documented here remains the only confirmed way to get that data out. If automated comps/skip-trace access is worth pursuing, the next step would be asking Realeflow support/sales directly whether LeadPipes endpoints exist under a different tier, rather than assuming they become available at any particular volume.</w:t>
+      </w:r>
+    </w:p>
+    <w:p>
+      <w:pPr>
+        <w:pStyle w:val="BodyText"/>
+        <w:rPr/>
+      </w:pPr>
+      <w:r>
+        <w:rPr/>
+        <w:t xml:space="preserve">A separate research pass (Aug. 2026) looked at RentCast and Mashvisor as possible additions. Neither is a substitute for a Realeflow API — both are AVM/market-analytics tools (property and rental valuations, cap rates, days-on-market) and neither offers ownership history, debt/lien records, or skip-trace, which is the data this workflow actually needs replaced. Given Realeflow’s documented API doesn’t cover that data either (see above), there is currently no confirmed API-based replacement path for Dealio.pro at all — RentCast and Mashvisor remain adjunct enrichment options only, e.g. a second independent AVM to cross-check the comps-derived ARV, or cap rate/DOM context for BRRRR and Turnkey strategy scoring — not a migration target for anything documented here.</w:t>
       </w:r>
     </w:p>
     <w:p>

</xml_diff>